<commit_message>
Re-update: Add development trends to opening report, ensuring correct insertion
</commit_message>
<xml_diff>
--- a/220208114-陈振贵-开题报告-更新版.docx
+++ b/220208114-陈振贵-开题报告-更新版.docx
@@ -7948,6 +7948,9 @@
       <w:bookmarkEnd w:id="15"/>
     </w:p>
     <w:p>
+      <w:pPr>
+        <w:spacing w:before="60" w:after="60"/>
+      </w:pPr>
       <w:r>
         <w:rPr>
           <w:rFonts w:ascii="宋体" w:hAnsi="宋体" w:eastAsia="宋体"/>
@@ -7957,6 +7960,9 @@
       </w:r>
     </w:p>
     <w:p>
+      <w:pPr>
+        <w:spacing w:before="60" w:after="60"/>
+      </w:pPr>
       <w:r>
         <w:rPr>
           <w:rFonts w:ascii="宋体" w:hAnsi="宋体" w:eastAsia="宋体"/>
@@ -7966,6 +7972,9 @@
       </w:r>
     </w:p>
     <w:p>
+      <w:pPr>
+        <w:spacing w:before="60" w:after="60"/>
+      </w:pPr>
       <w:r>
         <w:rPr>
           <w:rFonts w:ascii="宋体" w:hAnsi="宋体" w:eastAsia="宋体"/>
@@ -7975,6 +7984,9 @@
       </w:r>
     </w:p>
     <w:p>
+      <w:pPr>
+        <w:spacing w:before="60" w:after="60"/>
+      </w:pPr>
       <w:r>
         <w:rPr>
           <w:rFonts w:ascii="宋体" w:hAnsi="宋体" w:eastAsia="宋体"/>
@@ -7984,6 +7996,9 @@
       </w:r>
     </w:p>
     <w:p>
+      <w:pPr>
+        <w:spacing w:before="60" w:after="60"/>
+      </w:pPr>
       <w:r>
         <w:rPr>
           <w:rFonts w:ascii="宋体" w:hAnsi="宋体" w:eastAsia="宋体"/>

</xml_diff>